<commit_message>
vault backup: 2026-08-17 16:57:55
</commit_message>
<xml_diff>
--- a/Zamerke Antasline novi.docx
+++ b/Zamerke Antasline novi.docx
@@ -173,13 +173,7 @@
       </w:r>
       <w:proofErr w:type="spellEnd"/>
       <w:r>
-        <w:t xml:space="preserve"> koja nije dobra. </w:t>
-      </w:r>
-      <w:r>
-        <w:t>Koristi</w:t>
-      </w:r>
-      <w:r>
-        <w:t xml:space="preserve"> sliku proizvoda</w:t>
+        <w:t xml:space="preserve"> koja nije dobra. Koristi sliku proizvoda</w:t>
       </w:r>
     </w:p>
     <w:p/>
@@ -238,21 +232,45 @@
       </w:r>
       <w:proofErr w:type="spellEnd"/>
       <w:r>
-        <w:t>-ne vidi se tekst. Treba da se napravi kao desktopu</w:t>
-      </w:r>
-    </w:p>
+        <w:t>-ne vidi se tekst</w:t>
+      </w:r>
+      <w:r>
+        <w:t xml:space="preserve"> od pozadine</w:t>
+      </w:r>
+      <w:r>
+        <w:t>. Treba da se napravi kao desktopu</w:t>
+      </w:r>
+    </w:p>
+    <w:p>
+      <w:r>
+        <w:t xml:space="preserve">U </w:t>
+      </w:r>
+      <w:proofErr w:type="spellStart"/>
+      <w:r>
+        <w:t>futeru</w:t>
+      </w:r>
+      <w:proofErr w:type="spellEnd"/>
+      <w:r>
+        <w:t xml:space="preserve"> su ikonice za katalog, poziv i mejl. Treba da ide redosledom: Katalog, mejl i onda poziv. Za poziv ikonica treba da bude telefonska slušalica da naglasi pozivanje telefonom.</w:t>
+      </w:r>
+    </w:p>
+    <w:p/>
+    <w:p/>
+    <w:p/>
     <w:p/>
     <w:p>
       <w:pPr>
         <w:pStyle w:val="Naslov2"/>
       </w:pPr>
       <w:r>
-        <w:lastRenderedPageBreak/>
         <w:t xml:space="preserve">Planer terena </w:t>
       </w:r>
     </w:p>
     <w:p>
       <w:r>
+        <w:rPr>
+          <w:noProof/>
+        </w:rPr>
         <w:drawing>
           <wp:inline distT="0" distB="0" distL="0" distR="0" wp14:anchorId="7FD8DA45" wp14:editId="0FD4EDE7">
             <wp:extent cx="4642436" cy="3395207"/>
@@ -297,6 +315,10 @@
     </w:p>
     <w:p>
       <w:r>
+        <w:rPr>
+          <w:noProof/>
+        </w:rPr>
+        <w:lastRenderedPageBreak/>
         <w:drawing>
           <wp:inline distT="0" distB="0" distL="0" distR="0" wp14:anchorId="2C6A1C15" wp14:editId="42E7023E">
             <wp:extent cx="3896140" cy="3604531"/>
@@ -352,118 +374,118 @@
         <w:pStyle w:val="Naslov2"/>
       </w:pPr>
       <w:r>
+        <w:t xml:space="preserve">### FAZA 4: B2B </w:t>
+      </w:r>
+      <w:proofErr w:type="spellStart"/>
+      <w:r>
+        <w:t>Research</w:t>
+      </w:r>
+      <w:proofErr w:type="spellEnd"/>
+      <w:r>
+        <w:t xml:space="preserve"> &amp; </w:t>
+      </w:r>
+      <w:proofErr w:type="spellStart"/>
+      <w:r>
+        <w:t>Content</w:t>
+      </w:r>
+      <w:proofErr w:type="spellEnd"/>
+      <w:r>
+        <w:t xml:space="preserve"> </w:t>
+      </w:r>
+      <w:proofErr w:type="spellStart"/>
+      <w:r>
+        <w:t>Strategy</w:t>
+      </w:r>
+      <w:proofErr w:type="spellEnd"/>
+      <w:r>
+        <w:t xml:space="preserve"> (Industrijski &amp; ESD Podovi)</w:t>
+      </w:r>
+    </w:p>
+    <w:p/>
+    <w:p>
+      <w:r>
+        <w:t xml:space="preserve">Sprovedi detaljno istraživanje za sekciju **Industrijski podovi** (fokus na modularne PVC/LVT/ESD podne obloge, NE na liveni </w:t>
+      </w:r>
+      <w:proofErr w:type="spellStart"/>
+      <w:r>
+        <w:t>epoksid</w:t>
+      </w:r>
+      <w:proofErr w:type="spellEnd"/>
+      <w:r>
+        <w:t>/beton):</w:t>
+      </w:r>
+    </w:p>
+    <w:p>
+      <w:r>
+        <w:t>1. **Analiza problema i ciljne grupe:**</w:t>
+      </w:r>
+    </w:p>
+    <w:p>
+      <w:r>
+        <w:t xml:space="preserve">   - Koje konkretne probleme rešavaju naši industrijski podovi? (brza montaža bez zaustavljanja proizvodnje, otpornost na ulja/hemikalije, premošćavanje vlažnih podloga, ESD zaštita...).</w:t>
+      </w:r>
+    </w:p>
+    <w:p>
+      <w:r>
+        <w:t xml:space="preserve">   - Ko su kupci i industrijske niše (magacini, radionice, auto-servisi, teška industrija, farmacija)?</w:t>
+      </w:r>
+    </w:p>
+    <w:p>
+      <w:r>
+        <w:t>2. **Poseban fokus na ESD (</w:t>
+      </w:r>
+      <w:proofErr w:type="spellStart"/>
+      <w:r>
+        <w:t>Electrostatic</w:t>
+      </w:r>
+      <w:proofErr w:type="spellEnd"/>
+      <w:r>
+        <w:t xml:space="preserve"> </w:t>
+      </w:r>
+      <w:proofErr w:type="spellStart"/>
+      <w:r>
+        <w:t>Discharge</w:t>
+      </w:r>
+      <w:proofErr w:type="spellEnd"/>
+      <w:r>
+        <w:t>) podove:**</w:t>
+      </w:r>
+    </w:p>
+    <w:p>
+      <w:r>
+        <w:t xml:space="preserve">   - Šta rade, kako funkcionišu, koje standarde ispunjavaju?</w:t>
+      </w:r>
+    </w:p>
+    <w:p>
+      <w:r>
+        <w:t xml:space="preserve">   - Koji su rizični sektori (elektronska industrija, HTEC/</w:t>
+      </w:r>
+      <w:proofErr w:type="spellStart"/>
+      <w:r>
+        <w:t>Quectel</w:t>
+      </w:r>
+      <w:proofErr w:type="spellEnd"/>
+      <w:r>
+        <w:t xml:space="preserve"> tipovi objekata, servisi računara, čiste sobe, laboratorije)?</w:t>
+      </w:r>
+    </w:p>
+    <w:p>
+      <w:r>
+        <w:t xml:space="preserve">   - Kakve štete nastaju ako nemaju ESD pod i kako da ih </w:t>
+      </w:r>
+      <w:proofErr w:type="spellStart"/>
+      <w:r>
+        <w:t>targetiramo</w:t>
+      </w:r>
+      <w:proofErr w:type="spellEnd"/>
+      <w:r>
+        <w:t xml:space="preserve"> u prodajnom kopiju?</w:t>
+      </w:r>
+    </w:p>
+    <w:p/>
+    <w:p>
+      <w:r>
         <w:lastRenderedPageBreak/>
-        <w:t xml:space="preserve">### FAZA 4: B2B </w:t>
-      </w:r>
-      <w:proofErr w:type="spellStart"/>
-      <w:r>
-        <w:t>Research</w:t>
-      </w:r>
-      <w:proofErr w:type="spellEnd"/>
-      <w:r>
-        <w:t xml:space="preserve"> &amp; </w:t>
-      </w:r>
-      <w:proofErr w:type="spellStart"/>
-      <w:r>
-        <w:t>Content</w:t>
-      </w:r>
-      <w:proofErr w:type="spellEnd"/>
-      <w:r>
-        <w:t xml:space="preserve"> </w:t>
-      </w:r>
-      <w:proofErr w:type="spellStart"/>
-      <w:r>
-        <w:t>Strategy</w:t>
-      </w:r>
-      <w:proofErr w:type="spellEnd"/>
-      <w:r>
-        <w:t xml:space="preserve"> (Industrijski &amp; ESD Podovi)</w:t>
-      </w:r>
-    </w:p>
-    <w:p/>
-    <w:p>
-      <w:r>
-        <w:t xml:space="preserve">Sprovedi detaljno istraživanje za sekciju **Industrijski podovi** (fokus na modularne PVC/LVT/ESD podne obloge, NE na liveni </w:t>
-      </w:r>
-      <w:proofErr w:type="spellStart"/>
-      <w:r>
-        <w:t>epoksid</w:t>
-      </w:r>
-      <w:proofErr w:type="spellEnd"/>
-      <w:r>
-        <w:t>/beton):</w:t>
-      </w:r>
-    </w:p>
-    <w:p>
-      <w:r>
-        <w:t>1. **Analiza problema i ciljne grupe:**</w:t>
-      </w:r>
-    </w:p>
-    <w:p>
-      <w:r>
-        <w:t xml:space="preserve">   - Koje konkretne probleme rešavaju naši industrijski podovi? (brza montaža bez zaustavljanja proizvodnje, otpornost na ulja/hemikalije, premošćavanje vlažnih podloga, ESD zaštita...).</w:t>
-      </w:r>
-    </w:p>
-    <w:p>
-      <w:r>
-        <w:t xml:space="preserve">   - Ko su kupci i industrijske niše (magacini, radionice, auto-servisi, teška industrija, farmacija)?</w:t>
-      </w:r>
-    </w:p>
-    <w:p>
-      <w:r>
-        <w:t>2. **Poseban fokus na ESD (</w:t>
-      </w:r>
-      <w:proofErr w:type="spellStart"/>
-      <w:r>
-        <w:t>Electrostatic</w:t>
-      </w:r>
-      <w:proofErr w:type="spellEnd"/>
-      <w:r>
-        <w:t xml:space="preserve"> </w:t>
-      </w:r>
-      <w:proofErr w:type="spellStart"/>
-      <w:r>
-        <w:t>Discharge</w:t>
-      </w:r>
-      <w:proofErr w:type="spellEnd"/>
-      <w:r>
-        <w:t>) podove:**</w:t>
-      </w:r>
-    </w:p>
-    <w:p>
-      <w:r>
-        <w:t xml:space="preserve">   - Šta rade, kako funkcionišu, koje standarde ispunjavaju?</w:t>
-      </w:r>
-    </w:p>
-    <w:p>
-      <w:r>
-        <w:t xml:space="preserve">   - Koji su rizični sektori (elektronska industrija, HTEC/</w:t>
-      </w:r>
-      <w:proofErr w:type="spellStart"/>
-      <w:r>
-        <w:t>Quectel</w:t>
-      </w:r>
-      <w:proofErr w:type="spellEnd"/>
-      <w:r>
-        <w:t xml:space="preserve"> tipovi objekata, servisi računara, čiste sobe, laboratorije)?</w:t>
-      </w:r>
-    </w:p>
-    <w:p>
-      <w:r>
-        <w:t xml:space="preserve">   - Kakve štete nastaju ako nemaju ESD pod i kako da ih </w:t>
-      </w:r>
-      <w:proofErr w:type="spellStart"/>
-      <w:r>
-        <w:t>targetiramo</w:t>
-      </w:r>
-      <w:proofErr w:type="spellEnd"/>
-      <w:r>
-        <w:t xml:space="preserve"> u prodajnom kopiju?</w:t>
-      </w:r>
-    </w:p>
-    <w:p/>
-    <w:p>
-      <w:r>
         <w:t>---</w:t>
       </w:r>
     </w:p>

</xml_diff>

<commit_message>
vault backup: 2026-08-19 09:14:39
</commit_message>
<xml_diff>
--- a/Zamerke Antasline novi.docx
+++ b/Zamerke Antasline novi.docx
@@ -184,6 +184,9 @@
       <w:r>
         <w:t>Kategorije</w:t>
       </w:r>
+      <w:r>
+        <w:t xml:space="preserve"> Proizvoda</w:t>
+      </w:r>
     </w:p>
     <w:p>
       <w:r>
@@ -195,14 +198,37 @@
       </w:r>
       <w:proofErr w:type="spellEnd"/>
       <w:r>
-        <w:t xml:space="preserve"> kategorije mora da bude drugačije. Ovo sa svim kategorijama ovako u nizu je preveliko I nepregledno. Mora drugačije, kao na </w:t>
-      </w:r>
-      <w:proofErr w:type="spellStart"/>
-      <w:r>
-        <w:t>szvn</w:t>
-      </w:r>
-      <w:proofErr w:type="spellEnd"/>
-    </w:p>
+        <w:t xml:space="preserve"> kategorije mora da bude drugačije. Ovo sa svim kategorijama ovako u nizu je preveliko I nepregledno. </w:t>
+      </w:r>
+      <w:r>
+        <w:t>Bolja verzija je side menu</w:t>
+      </w:r>
+      <w:r>
+        <w:t xml:space="preserve"> kao na </w:t>
+      </w:r>
+      <w:hyperlink r:id="rId5" w:history="1">
+        <w:r>
+          <w:rPr>
+            <w:rStyle w:val="Hiperveza"/>
+          </w:rPr>
+          <w:t>https://svezavideonadzor.rs/kategorija-proizvoda/video-nadzor/</w:t>
+        </w:r>
+      </w:hyperlink>
+    </w:p>
+    <w:p>
+      <w:r>
+        <w:t xml:space="preserve">Izbaciti </w:t>
+      </w:r>
+      <w:proofErr w:type="spellStart"/>
+      <w:r>
+        <w:t>bergo</w:t>
+      </w:r>
+      <w:proofErr w:type="spellEnd"/>
+      <w:r>
+        <w:t xml:space="preserve"> ploče iz kategorije košarkaške konstrukcije</w:t>
+      </w:r>
+    </w:p>
+    <w:p/>
     <w:p/>
     <w:p>
       <w:pPr>
@@ -243,6 +269,7 @@
     </w:p>
     <w:p>
       <w:r>
+        <w:lastRenderedPageBreak/>
         <w:t xml:space="preserve">U </w:t>
       </w:r>
       <w:proofErr w:type="spellStart"/>
@@ -254,8 +281,24 @@
         <w:t xml:space="preserve"> su ikonice za katalog, poziv i mejl. Treba da ide redosledom: Katalog, mejl i onda poziv. Za poziv ikonica treba da bude telefonska slušalica da naglasi pozivanje telefonom.</w:t>
       </w:r>
     </w:p>
-    <w:p/>
-    <w:p/>
+    <w:p>
+      <w:r>
+        <w:t>Dugme katalog daje izlistano sve proizvode-treba da prikaže kategorije sa slikom.</w:t>
+      </w:r>
+    </w:p>
+    <w:p>
+      <w:r>
+        <w:t xml:space="preserve">U </w:t>
+      </w:r>
+      <w:proofErr w:type="spellStart"/>
+      <w:r>
+        <w:t>hederu</w:t>
+      </w:r>
+      <w:proofErr w:type="spellEnd"/>
+      <w:r>
+        <w:t xml:space="preserve"> je dugme za poziv mobilnog telefona, ali je ikonica loša. Treba da bude telefonska slušalica ili slično, da naglasi da će da se izvrši poziv klikom na dugme.</w:t>
+      </w:r>
+    </w:p>
     <w:p/>
     <w:p/>
     <w:p>
@@ -287,7 +330,7 @@
                     <pic:cNvPicPr/>
                   </pic:nvPicPr>
                   <pic:blipFill>
-                    <a:blip r:embed="rId5"/>
+                    <a:blip r:embed="rId6"/>
                     <a:stretch>
                       <a:fillRect/>
                     </a:stretch>
@@ -335,7 +378,7 @@
                     <pic:cNvPicPr/>
                   </pic:nvPicPr>
                   <pic:blipFill>
-                    <a:blip r:embed="rId6"/>
+                    <a:blip r:embed="rId7"/>
                     <a:stretch>
                       <a:fillRect/>
                     </a:stretch>
@@ -374,128 +417,13 @@
         <w:pStyle w:val="Naslov2"/>
       </w:pPr>
       <w:r>
-        <w:t xml:space="preserve">### FAZA 4: B2B </w:t>
-      </w:r>
-      <w:proofErr w:type="spellStart"/>
-      <w:r>
-        <w:t>Research</w:t>
-      </w:r>
-      <w:proofErr w:type="spellEnd"/>
-      <w:r>
-        <w:t xml:space="preserve"> &amp; </w:t>
-      </w:r>
-      <w:proofErr w:type="spellStart"/>
-      <w:r>
-        <w:t>Content</w:t>
-      </w:r>
-      <w:proofErr w:type="spellEnd"/>
-      <w:r>
-        <w:t xml:space="preserve"> </w:t>
-      </w:r>
-      <w:proofErr w:type="spellStart"/>
-      <w:r>
-        <w:t>Strategy</w:t>
-      </w:r>
-      <w:proofErr w:type="spellEnd"/>
-      <w:r>
-        <w:t xml:space="preserve"> (Industrijski &amp; ESD Podovi)</w:t>
-      </w:r>
-    </w:p>
-    <w:p/>
-    <w:p>
-      <w:r>
-        <w:t xml:space="preserve">Sprovedi detaljno istraživanje za sekciju **Industrijski podovi** (fokus na modularne PVC/LVT/ESD podne obloge, NE na liveni </w:t>
-      </w:r>
-      <w:proofErr w:type="spellStart"/>
-      <w:r>
-        <w:t>epoksid</w:t>
-      </w:r>
-      <w:proofErr w:type="spellEnd"/>
-      <w:r>
-        <w:t>/beton):</w:t>
-      </w:r>
-    </w:p>
-    <w:p>
-      <w:r>
-        <w:t>1. **Analiza problema i ciljne grupe:**</w:t>
-      </w:r>
-    </w:p>
-    <w:p>
-      <w:r>
-        <w:t xml:space="preserve">   - Koje konkretne probleme rešavaju naši industrijski podovi? (brza montaža bez zaustavljanja proizvodnje, otpornost na ulja/hemikalije, premošćavanje vlažnih podloga, ESD zaštita...).</w:t>
-      </w:r>
-    </w:p>
-    <w:p>
-      <w:r>
-        <w:t xml:space="preserve">   - Ko su kupci i industrijske niše (magacini, radionice, auto-servisi, teška industrija, farmacija)?</w:t>
-      </w:r>
-    </w:p>
-    <w:p>
-      <w:r>
-        <w:t>2. **Poseban fokus na ESD (</w:t>
-      </w:r>
-      <w:proofErr w:type="spellStart"/>
-      <w:r>
-        <w:t>Electrostatic</w:t>
-      </w:r>
-      <w:proofErr w:type="spellEnd"/>
-      <w:r>
-        <w:t xml:space="preserve"> </w:t>
-      </w:r>
-      <w:proofErr w:type="spellStart"/>
-      <w:r>
-        <w:t>Discharge</w:t>
-      </w:r>
-      <w:proofErr w:type="spellEnd"/>
-      <w:r>
-        <w:t>) podove:**</w:t>
-      </w:r>
-    </w:p>
-    <w:p>
-      <w:r>
-        <w:t xml:space="preserve">   - Šta rade, kako funkcionišu, koje standarde ispunjavaju?</w:t>
-      </w:r>
-    </w:p>
-    <w:p>
-      <w:r>
-        <w:t xml:space="preserve">   - Koji su rizični sektori (elektronska industrija, HTEC/</w:t>
-      </w:r>
-      <w:proofErr w:type="spellStart"/>
-      <w:r>
-        <w:t>Quectel</w:t>
-      </w:r>
-      <w:proofErr w:type="spellEnd"/>
-      <w:r>
-        <w:t xml:space="preserve"> tipovi objekata, servisi računara, čiste sobe, laboratorije)?</w:t>
-      </w:r>
-    </w:p>
-    <w:p>
-      <w:r>
-        <w:t xml:space="preserve">   - Kakve štete nastaju ako nemaju ESD pod i kako da ih </w:t>
-      </w:r>
-      <w:proofErr w:type="spellStart"/>
-      <w:r>
-        <w:t>targetiramo</w:t>
-      </w:r>
-      <w:proofErr w:type="spellEnd"/>
-      <w:r>
-        <w:t xml:space="preserve"> u prodajnom kopiju?</w:t>
-      </w:r>
-    </w:p>
-    <w:p/>
-    <w:p>
-      <w:r>
-        <w:lastRenderedPageBreak/>
-        <w:t>---</w:t>
-      </w:r>
-    </w:p>
-    <w:p>
-      <w:pPr>
-        <w:pStyle w:val="Naslov2"/>
-      </w:pPr>
-      <w:r>
-        <w:t>Pomoć drugih ai</w:t>
-      </w:r>
+        <w:t xml:space="preserve">Pomoć drugih </w:t>
+      </w:r>
+      <w:proofErr w:type="spellStart"/>
+      <w:r>
+        <w:t>ai</w:t>
+      </w:r>
+      <w:proofErr w:type="spellEnd"/>
     </w:p>
     <w:p>
       <w:r>

</xml_diff>

<commit_message>
vault backup: 2026-08-21 16:39:17
</commit_message>
<xml_diff>
--- a/Zamerke Antasline novi.docx
+++ b/Zamerke Antasline novi.docx
@@ -29,7 +29,19 @@
     </w:p>
     <w:p>
       <w:r>
-        <w:t xml:space="preserve">Kontakt sekcija je previše </w:t>
+        <w:t xml:space="preserve">Kontakt sekcija </w:t>
+      </w:r>
+      <w:r>
+        <w:t xml:space="preserve">na svim stranicama </w:t>
+      </w:r>
+      <w:r>
+        <w:t xml:space="preserve">je </w:t>
+      </w:r>
+      <w:r>
+        <w:t xml:space="preserve"> sa </w:t>
+      </w:r>
+      <w:r>
+        <w:t xml:space="preserve">previše </w:t>
       </w:r>
       <w:proofErr w:type="spellStart"/>
       <w:r>
@@ -45,51 +57,299 @@
       <w:pPr>
         <w:pStyle w:val="Naslov2"/>
       </w:pPr>
-      <w:proofErr w:type="spellStart"/>
-      <w:r>
-        <w:t>Sajdbar</w:t>
-      </w:r>
-      <w:proofErr w:type="spellEnd"/>
-    </w:p>
-    <w:p>
-      <w:proofErr w:type="spellStart"/>
-      <w:r>
-        <w:t>sajdbar</w:t>
-      </w:r>
-      <w:proofErr w:type="spellEnd"/>
-      <w:r>
-        <w:t xml:space="preserve"> na postovima - ostaviti samo kategorije. Deo </w:t>
-      </w:r>
-      <w:proofErr w:type="spellStart"/>
-      <w:r>
-        <w:t>search</w:t>
-      </w:r>
-      <w:proofErr w:type="spellEnd"/>
-      <w:r>
-        <w:t xml:space="preserve"> </w:t>
-      </w:r>
-      <w:proofErr w:type="spellStart"/>
-      <w:r>
-        <w:t>for</w:t>
-      </w:r>
-      <w:proofErr w:type="spellEnd"/>
-      <w:r>
-        <w:t xml:space="preserve"> </w:t>
-      </w:r>
-      <w:proofErr w:type="spellStart"/>
-      <w:r>
-        <w:t>posts</w:t>
-      </w:r>
-      <w:proofErr w:type="spellEnd"/>
-      <w:r>
-        <w:t xml:space="preserve"> je na engleskom-prevedi.</w:t>
+      <w:r>
+        <w:t>HOME PAGE</w:t>
+      </w:r>
+    </w:p>
+    <w:p>
+      <w:r>
+        <w:t xml:space="preserve">PODOVI KOJI IZDRZE SVE --- </w:t>
+      </w:r>
+      <w:proofErr w:type="spellStart"/>
+      <w:r>
+        <w:t>nesto</w:t>
+      </w:r>
+      <w:proofErr w:type="spellEnd"/>
+      <w:r>
+        <w:t xml:space="preserve"> mi bezveze, </w:t>
+      </w:r>
+      <w:proofErr w:type="spellStart"/>
+      <w:r>
+        <w:t>mozda</w:t>
+      </w:r>
+      <w:proofErr w:type="spellEnd"/>
+      <w:r>
+        <w:t xml:space="preserve"> PROFESIONALNA RESENJA ZA SVAKI PROSTOR ili RESENJA KOJA TRAJU</w:t>
+      </w:r>
+      <w:r>
+        <w:t xml:space="preserve"> – predloži nešto novo.</w:t>
+      </w:r>
+    </w:p>
+    <w:p>
+      <w:pPr>
+        <w:pStyle w:val="Naslov3"/>
+      </w:pPr>
+      <w:r>
+        <w:t>NAJPRODAVANIJI PROIZVODI sekcija</w:t>
+      </w:r>
+    </w:p>
+    <w:p>
+      <w:proofErr w:type="spellStart"/>
+      <w:r>
+        <w:t>Antistatik</w:t>
+      </w:r>
+      <w:proofErr w:type="spellEnd"/>
+      <w:r>
+        <w:t xml:space="preserve"> ESD podloga</w:t>
+      </w:r>
+    </w:p>
+    <w:p>
+      <w:proofErr w:type="spellStart"/>
+      <w:r>
+        <w:t>Bergo</w:t>
+      </w:r>
+      <w:proofErr w:type="spellEnd"/>
+      <w:r>
+        <w:t xml:space="preserve"> </w:t>
+      </w:r>
+      <w:proofErr w:type="spellStart"/>
+      <w:r>
+        <w:t>ultimate</w:t>
+      </w:r>
+      <w:proofErr w:type="spellEnd"/>
+      <w:r>
+        <w:t xml:space="preserve"> sportska podloga</w:t>
+      </w:r>
+    </w:p>
+    <w:p>
+      <w:proofErr w:type="spellStart"/>
+      <w:r>
+        <w:t>Insudtrijski</w:t>
+      </w:r>
+      <w:proofErr w:type="spellEnd"/>
+      <w:r>
+        <w:t xml:space="preserve"> pod </w:t>
+      </w:r>
+      <w:proofErr w:type="spellStart"/>
+      <w:r>
+        <w:t>Ecotile</w:t>
+      </w:r>
+      <w:proofErr w:type="spellEnd"/>
+      <w:r>
+        <w:t xml:space="preserve"> rx500/7</w:t>
+      </w:r>
+    </w:p>
+    <w:p>
+      <w:r>
+        <w:t>I ostavi jedan koš. Četiri proizvoda izgledaju simetrično</w:t>
+      </w:r>
+    </w:p>
+    <w:p>
+      <w:pPr>
+        <w:pStyle w:val="Naslov3"/>
+      </w:pPr>
+      <w:r>
+        <w:t>Veruju nam sekcija</w:t>
+      </w:r>
+    </w:p>
+    <w:p>
+      <w:proofErr w:type="spellStart"/>
+      <w:r>
+        <w:t>lUSTICA</w:t>
+      </w:r>
+      <w:proofErr w:type="spellEnd"/>
+      <w:r>
+        <w:t xml:space="preserve"> BAY – </w:t>
+      </w:r>
+      <w:proofErr w:type="spellStart"/>
+      <w:r>
+        <w:t>montenegro</w:t>
+      </w:r>
+      <w:proofErr w:type="spellEnd"/>
+      <w:r>
+        <w:t xml:space="preserve"> – dodaj i ovo u grupu.</w:t>
+      </w:r>
+      <w:r>
+        <w:rPr>
+          <w:noProof/>
+        </w:rPr>
+        <w:drawing>
+          <wp:inline distT="0" distB="0" distL="0" distR="0" wp14:anchorId="78E5C293" wp14:editId="6C9F36DC">
+            <wp:extent cx="3366056" cy="2044700"/>
+            <wp:effectExtent l="0" t="0" r="6350" b="0"/>
+            <wp:docPr id="1899752732" name="Slika 1"/>
+            <wp:cNvGraphicFramePr>
+              <a:graphicFrameLocks xmlns:a="http://schemas.openxmlformats.org/drawingml/2006/main" noChangeAspect="1"/>
+            </wp:cNvGraphicFramePr>
+            <a:graphic xmlns:a="http://schemas.openxmlformats.org/drawingml/2006/main">
+              <a:graphicData uri="http://schemas.openxmlformats.org/drawingml/2006/picture">
+                <pic:pic xmlns:pic="http://schemas.openxmlformats.org/drawingml/2006/picture">
+                  <pic:nvPicPr>
+                    <pic:cNvPr id="0" name="Picture 1"/>
+                    <pic:cNvPicPr>
+                      <a:picLocks noChangeAspect="1" noChangeArrowheads="1"/>
+                    </pic:cNvPicPr>
+                  </pic:nvPicPr>
+                  <pic:blipFill>
+                    <a:blip r:embed="rId4" cstate="print">
+                      <a:extLst>
+                        <a:ext uri="{28A0092B-C50C-407E-A947-70E740481C1C}">
+                          <a14:useLocalDpi xmlns:a14="http://schemas.microsoft.com/office/drawing/2010/main" val="0"/>
+                        </a:ext>
+                      </a:extLst>
+                    </a:blip>
+                    <a:srcRect/>
+                    <a:stretch>
+                      <a:fillRect/>
+                    </a:stretch>
+                  </pic:blipFill>
+                  <pic:spPr bwMode="auto">
+                    <a:xfrm>
+                      <a:off x="0" y="0"/>
+                      <a:ext cx="3371848" cy="2048218"/>
+                    </a:xfrm>
+                    <a:prstGeom prst="rect">
+                      <a:avLst/>
+                    </a:prstGeom>
+                    <a:noFill/>
+                    <a:ln>
+                      <a:noFill/>
+                    </a:ln>
+                  </pic:spPr>
+                </pic:pic>
+              </a:graphicData>
+            </a:graphic>
+          </wp:inline>
+        </w:drawing>
       </w:r>
     </w:p>
     <w:p/>
+    <w:p>
+      <w:r>
+        <w:t>Zastupamo renomirane svetske proizvođače:</w:t>
+      </w:r>
+    </w:p>
+    <w:p>
+      <w:proofErr w:type="spellStart"/>
+      <w:r>
+        <w:t>Ecotile</w:t>
+      </w:r>
+      <w:proofErr w:type="spellEnd"/>
+      <w:r>
+        <w:t xml:space="preserve">, </w:t>
+      </w:r>
+      <w:proofErr w:type="spellStart"/>
+      <w:r>
+        <w:t>Bergo</w:t>
+      </w:r>
+      <w:proofErr w:type="spellEnd"/>
+      <w:r>
+        <w:t xml:space="preserve"> </w:t>
+      </w:r>
+      <w:proofErr w:type="spellStart"/>
+      <w:r>
+        <w:t>flooring</w:t>
+      </w:r>
+      <w:proofErr w:type="spellEnd"/>
+      <w:r>
+        <w:t xml:space="preserve">, </w:t>
+      </w:r>
+      <w:proofErr w:type="spellStart"/>
+      <w:r>
+        <w:t>Ergomat</w:t>
+      </w:r>
+      <w:proofErr w:type="spellEnd"/>
+      <w:r>
+        <w:t xml:space="preserve">, </w:t>
+      </w:r>
+      <w:proofErr w:type="spellStart"/>
+      <w:r>
+        <w:t>Sportpartner</w:t>
+      </w:r>
+      <w:proofErr w:type="spellEnd"/>
+      <w:r>
+        <w:t xml:space="preserve">, </w:t>
+      </w:r>
+      <w:proofErr w:type="spellStart"/>
+      <w:r>
+        <w:t>Condor</w:t>
+      </w:r>
+      <w:proofErr w:type="spellEnd"/>
+      <w:r>
+        <w:t xml:space="preserve"> </w:t>
+      </w:r>
+      <w:proofErr w:type="spellStart"/>
+      <w:r>
+        <w:t>grass</w:t>
+      </w:r>
+      <w:proofErr w:type="spellEnd"/>
+      <w:r>
+        <w:t xml:space="preserve">, </w:t>
+      </w:r>
+      <w:proofErr w:type="spellStart"/>
+      <w:r>
+        <w:t>Objectflor</w:t>
+      </w:r>
+      <w:proofErr w:type="spellEnd"/>
+      <w:r>
+        <w:t xml:space="preserve">, </w:t>
+      </w:r>
+      <w:proofErr w:type="spellStart"/>
+      <w:r>
+        <w:t>Isotrack</w:t>
+      </w:r>
+      <w:proofErr w:type="spellEnd"/>
+    </w:p>
     <w:p>
       <w:pPr>
         <w:pStyle w:val="Naslov2"/>
       </w:pPr>
+      <w:proofErr w:type="spellStart"/>
+      <w:r>
+        <w:lastRenderedPageBreak/>
+        <w:t>Sajdbar</w:t>
+      </w:r>
+      <w:proofErr w:type="spellEnd"/>
+    </w:p>
+    <w:p>
+      <w:proofErr w:type="spellStart"/>
+      <w:r>
+        <w:t>sajdbar</w:t>
+      </w:r>
+      <w:proofErr w:type="spellEnd"/>
+      <w:r>
+        <w:t xml:space="preserve"> na postovima - ostaviti samo kategorije. Deo </w:t>
+      </w:r>
+      <w:proofErr w:type="spellStart"/>
+      <w:r>
+        <w:t>search</w:t>
+      </w:r>
+      <w:proofErr w:type="spellEnd"/>
+      <w:r>
+        <w:t xml:space="preserve"> </w:t>
+      </w:r>
+      <w:proofErr w:type="spellStart"/>
+      <w:r>
+        <w:t>for</w:t>
+      </w:r>
+      <w:proofErr w:type="spellEnd"/>
+      <w:r>
+        <w:t xml:space="preserve"> </w:t>
+      </w:r>
+      <w:proofErr w:type="spellStart"/>
+      <w:r>
+        <w:t>posts</w:t>
+      </w:r>
+      <w:proofErr w:type="spellEnd"/>
+      <w:r>
+        <w:t xml:space="preserve"> je na engleskom-prevedi.</w:t>
+      </w:r>
+    </w:p>
+    <w:p/>
+    <w:p>
+      <w:pPr>
+        <w:pStyle w:val="Naslov2"/>
+      </w:pPr>
       <w:r>
         <w:t>Stranice</w:t>
       </w:r>
@@ -156,7 +416,7 @@
       <w:r>
         <w:t xml:space="preserve">Stranica: </w:t>
       </w:r>
-      <w:hyperlink r:id="rId4" w:history="1">
+      <w:hyperlink r:id="rId5" w:history="1">
         <w:r>
           <w:rPr>
             <w:rStyle w:val="Hiperveza"/>
@@ -179,6 +439,1307 @@
     <w:p/>
     <w:p>
       <w:pPr>
+        <w:pStyle w:val="Naslov3"/>
+        <w:rPr>
+          <w:lang w:val="en-US"/>
+        </w:rPr>
+      </w:pPr>
+      <w:proofErr w:type="spellStart"/>
+      <w:r>
+        <w:rPr>
+          <w:lang w:val="en-US"/>
+        </w:rPr>
+        <w:t>tereni</w:t>
+      </w:r>
+      <w:proofErr w:type="spellEnd"/>
+      <w:r>
+        <w:rPr>
+          <w:lang w:val="en-US"/>
+        </w:rPr>
+        <w:t xml:space="preserve"> za 3x3 https://staging.antasline.com/kosarka-3x3-tereni/</w:t>
+      </w:r>
+    </w:p>
+    <w:p>
+      <w:pPr>
+        <w:rPr>
+          <w:lang w:val="en-US"/>
+        </w:rPr>
+      </w:pPr>
+      <w:proofErr w:type="spellStart"/>
+      <w:r>
+        <w:rPr>
+          <w:lang w:val="en-US"/>
+        </w:rPr>
+        <w:t>Promeni</w:t>
+      </w:r>
+      <w:proofErr w:type="spellEnd"/>
+      <w:r>
+        <w:rPr>
+          <w:lang w:val="en-US"/>
+        </w:rPr>
+        <w:t xml:space="preserve"> </w:t>
+      </w:r>
+      <w:proofErr w:type="spellStart"/>
+      <w:r>
+        <w:rPr>
+          <w:lang w:val="en-US"/>
+        </w:rPr>
+        <w:t>sliku</w:t>
+      </w:r>
+      <w:proofErr w:type="spellEnd"/>
+      <w:r>
+        <w:rPr>
+          <w:lang w:val="en-US"/>
+        </w:rPr>
+        <w:t xml:space="preserve"> </w:t>
+      </w:r>
+      <w:proofErr w:type="spellStart"/>
+      <w:r>
+        <w:rPr>
+          <w:lang w:val="en-US"/>
+        </w:rPr>
+        <w:t>pozadinsku</w:t>
+      </w:r>
+      <w:proofErr w:type="spellEnd"/>
+      <w:r>
+        <w:rPr>
+          <w:lang w:val="en-US"/>
+        </w:rPr>
+        <w:t xml:space="preserve"> u </w:t>
+      </w:r>
+      <w:proofErr w:type="spellStart"/>
+      <w:r>
+        <w:rPr>
+          <w:lang w:val="en-US"/>
+        </w:rPr>
+        <w:t>naslovu</w:t>
+      </w:r>
+      <w:proofErr w:type="spellEnd"/>
+      <w:r>
+        <w:rPr>
+          <w:lang w:val="en-US"/>
+        </w:rPr>
+        <w:t xml:space="preserve">, </w:t>
+      </w:r>
+      <w:proofErr w:type="spellStart"/>
+      <w:r>
+        <w:rPr>
+          <w:lang w:val="en-US"/>
+        </w:rPr>
+        <w:t>stavi</w:t>
+      </w:r>
+      <w:proofErr w:type="spellEnd"/>
+      <w:r>
+        <w:rPr>
+          <w:lang w:val="en-US"/>
+        </w:rPr>
+        <w:t xml:space="preserve"> </w:t>
+      </w:r>
+      <w:proofErr w:type="spellStart"/>
+      <w:r>
+        <w:rPr>
+          <w:lang w:val="en-US"/>
+        </w:rPr>
+        <w:t>neki</w:t>
+      </w:r>
+      <w:proofErr w:type="spellEnd"/>
+      <w:r>
+        <w:rPr>
+          <w:lang w:val="en-US"/>
+        </w:rPr>
+        <w:t xml:space="preserve"> basket </w:t>
+      </w:r>
+    </w:p>
+    <w:p>
+      <w:pPr>
+        <w:rPr>
+          <w:lang w:val="en-US"/>
+        </w:rPr>
+      </w:pPr>
+      <w:r>
+        <w:rPr>
+          <w:lang w:val="en-US"/>
+        </w:rPr>
+        <w:drawing>
+          <wp:inline distT="0" distB="0" distL="0" distR="0" wp14:anchorId="197DE414" wp14:editId="4D717194">
+            <wp:extent cx="2241550" cy="1682750"/>
+            <wp:effectExtent l="0" t="0" r="6350" b="0"/>
+            <wp:docPr id="1099867317" name="Slika 3" descr="Teren za basket na Avali.jpg"/>
+            <wp:cNvGraphicFramePr>
+              <a:graphicFrameLocks xmlns:a="http://schemas.openxmlformats.org/drawingml/2006/main" noChangeAspect="1"/>
+            </wp:cNvGraphicFramePr>
+            <a:graphic xmlns:a="http://schemas.openxmlformats.org/drawingml/2006/main">
+              <a:graphicData uri="http://schemas.openxmlformats.org/drawingml/2006/picture">
+                <pic:pic xmlns:pic="http://schemas.openxmlformats.org/drawingml/2006/picture">
+                  <pic:nvPicPr>
+                    <pic:cNvPr id="0" name="Picture 0" descr="Teren za basket na Avali.jpg"/>
+                    <pic:cNvPicPr>
+                      <a:picLocks noChangeAspect="1" noChangeArrowheads="1"/>
+                    </pic:cNvPicPr>
+                  </pic:nvPicPr>
+                  <pic:blipFill>
+                    <a:blip r:embed="rId6" cstate="print">
+                      <a:extLst>
+                        <a:ext uri="{28A0092B-C50C-407E-A947-70E740481C1C}">
+                          <a14:useLocalDpi xmlns:a14="http://schemas.microsoft.com/office/drawing/2010/main" val="0"/>
+                        </a:ext>
+                      </a:extLst>
+                    </a:blip>
+                    <a:srcRect/>
+                    <a:stretch>
+                      <a:fillRect/>
+                    </a:stretch>
+                  </pic:blipFill>
+                  <pic:spPr bwMode="auto">
+                    <a:xfrm>
+                      <a:off x="0" y="0"/>
+                      <a:ext cx="2241550" cy="1682750"/>
+                    </a:xfrm>
+                    <a:prstGeom prst="rect">
+                      <a:avLst/>
+                    </a:prstGeom>
+                    <a:noFill/>
+                    <a:ln>
+                      <a:noFill/>
+                    </a:ln>
+                  </pic:spPr>
+                </pic:pic>
+              </a:graphicData>
+            </a:graphic>
+          </wp:inline>
+        </w:drawing>
+      </w:r>
+    </w:p>
+    <w:p>
+      <w:pPr>
+        <w:rPr>
+          <w:lang w:val="en-US"/>
+        </w:rPr>
+      </w:pPr>
+      <w:r>
+        <w:rPr>
+          <w:lang w:val="en-US"/>
+        </w:rPr>
+        <w:t xml:space="preserve">SERTIFIKOVANA PODLOGA ZA RASTUĆI FORMAT - </w:t>
+      </w:r>
+      <w:proofErr w:type="spellStart"/>
+      <w:r>
+        <w:rPr>
+          <w:lang w:val="en-US"/>
+        </w:rPr>
+        <w:t>ovo</w:t>
+      </w:r>
+      <w:proofErr w:type="spellEnd"/>
+      <w:r>
+        <w:rPr>
+          <w:lang w:val="en-US"/>
+        </w:rPr>
+        <w:t xml:space="preserve"> mi </w:t>
+      </w:r>
+      <w:proofErr w:type="spellStart"/>
+      <w:r>
+        <w:rPr>
+          <w:lang w:val="en-US"/>
+        </w:rPr>
+        <w:t>bezveze</w:t>
+      </w:r>
+      <w:proofErr w:type="spellEnd"/>
+      <w:r>
+        <w:rPr>
+          <w:lang w:val="en-US"/>
+        </w:rPr>
+        <w:t xml:space="preserve">, </w:t>
+      </w:r>
+      <w:proofErr w:type="spellStart"/>
+      <w:r>
+        <w:rPr>
+          <w:lang w:val="en-US"/>
+        </w:rPr>
+        <w:t>može</w:t>
+      </w:r>
+      <w:proofErr w:type="spellEnd"/>
+      <w:r>
+        <w:rPr>
+          <w:lang w:val="en-US"/>
+        </w:rPr>
+        <w:t xml:space="preserve"> </w:t>
+      </w:r>
+      <w:r>
+        <w:rPr>
+          <w:lang w:val="en-US"/>
+        </w:rPr>
+        <w:t>PODLOGA ZA BASKET I 3X3 SA 50 GODINA TRADICIJE I ISKUSTVA</w:t>
+      </w:r>
+      <w:r>
+        <w:rPr>
+          <w:lang w:val="en-US"/>
+        </w:rPr>
+        <w:t xml:space="preserve"> – </w:t>
+      </w:r>
+      <w:proofErr w:type="spellStart"/>
+      <w:r>
+        <w:rPr>
+          <w:lang w:val="en-US"/>
+        </w:rPr>
+        <w:t>ovako</w:t>
+      </w:r>
+      <w:proofErr w:type="spellEnd"/>
+      <w:r>
+        <w:rPr>
+          <w:lang w:val="en-US"/>
+        </w:rPr>
+        <w:t xml:space="preserve"> </w:t>
+      </w:r>
+      <w:proofErr w:type="spellStart"/>
+      <w:r>
+        <w:rPr>
+          <w:lang w:val="en-US"/>
+        </w:rPr>
+        <w:t>nešto</w:t>
+      </w:r>
+      <w:proofErr w:type="spellEnd"/>
+      <w:r>
+        <w:rPr>
+          <w:lang w:val="en-US"/>
+        </w:rPr>
+        <w:t xml:space="preserve"> </w:t>
+      </w:r>
+      <w:proofErr w:type="spellStart"/>
+      <w:r>
+        <w:rPr>
+          <w:lang w:val="en-US"/>
+        </w:rPr>
+        <w:t>stavi</w:t>
+      </w:r>
+      <w:proofErr w:type="spellEnd"/>
+    </w:p>
+    <w:p>
+      <w:pPr>
+        <w:rPr>
+          <w:b/>
+          <w:bCs/>
+          <w:lang w:val="en-US"/>
+        </w:rPr>
+      </w:pPr>
+      <w:proofErr w:type="spellStart"/>
+      <w:r>
+        <w:rPr>
+          <w:b/>
+          <w:bCs/>
+          <w:lang w:val="en-US"/>
+        </w:rPr>
+        <w:t>Montaža</w:t>
+      </w:r>
+      <w:proofErr w:type="spellEnd"/>
+      <w:r>
+        <w:rPr>
+          <w:b/>
+          <w:bCs/>
+          <w:lang w:val="en-US"/>
+        </w:rPr>
+        <w:t xml:space="preserve"> bez </w:t>
+      </w:r>
+      <w:proofErr w:type="spellStart"/>
+      <w:r>
+        <w:rPr>
+          <w:b/>
+          <w:bCs/>
+          <w:lang w:val="en-US"/>
+        </w:rPr>
+        <w:t>temelja</w:t>
+      </w:r>
+      <w:proofErr w:type="spellEnd"/>
+      <w:r>
+        <w:rPr>
+          <w:b/>
+          <w:bCs/>
+          <w:lang w:val="en-US"/>
+        </w:rPr>
+        <w:t xml:space="preserve"> je </w:t>
+      </w:r>
+      <w:proofErr w:type="spellStart"/>
+      <w:r>
+        <w:rPr>
+          <w:b/>
+          <w:bCs/>
+          <w:lang w:val="en-US"/>
+        </w:rPr>
+        <w:t>jedan</w:t>
+      </w:r>
+      <w:proofErr w:type="spellEnd"/>
+      <w:r>
+        <w:rPr>
+          <w:b/>
+          <w:bCs/>
+          <w:lang w:val="en-US"/>
+        </w:rPr>
+        <w:t xml:space="preserve"> od </w:t>
+      </w:r>
+      <w:proofErr w:type="spellStart"/>
+      <w:r>
+        <w:rPr>
+          <w:b/>
+          <w:bCs/>
+          <w:lang w:val="en-US"/>
+        </w:rPr>
+        <w:t>benefita</w:t>
+      </w:r>
+      <w:proofErr w:type="spellEnd"/>
+    </w:p>
+    <w:p>
+      <w:pPr>
+        <w:rPr>
+          <w:lang w:val="en-US"/>
+        </w:rPr>
+      </w:pPr>
+      <w:r>
+        <w:rPr>
+          <w:lang w:val="en-US"/>
+        </w:rPr>
+        <w:t>JEDNOSTAVNA MONTAZA - DUG VEK TRAJANJA</w:t>
+      </w:r>
+    </w:p>
+    <w:p>
+      <w:pPr>
+        <w:rPr>
+          <w:lang w:val="en-US"/>
+        </w:rPr>
+      </w:pPr>
+      <w:r>
+        <w:rPr>
+          <w:lang w:val="en-US"/>
+        </w:rPr>
+        <w:t>DIMENZIJE 3×3 TERENA I TEHNIČKI PODACI</w:t>
+      </w:r>
+    </w:p>
+    <w:p>
+      <w:pPr>
+        <w:rPr>
+          <w:lang w:val="en-US"/>
+        </w:rPr>
+      </w:pPr>
+      <w:r>
+        <w:rPr>
+          <w:lang w:val="en-US"/>
+        </w:rPr>
+        <w:t>DIMENZIJE TERENA I TEHNICKI PODACI</w:t>
+      </w:r>
+    </w:p>
+    <w:p>
+      <w:pPr>
+        <w:rPr>
+          <w:lang w:val="en-US"/>
+        </w:rPr>
+      </w:pPr>
+      <w:proofErr w:type="spellStart"/>
+      <w:r>
+        <w:rPr>
+          <w:lang w:val="en-US"/>
+        </w:rPr>
+        <w:t>Dimenzija</w:t>
+      </w:r>
+      <w:proofErr w:type="spellEnd"/>
+      <w:r>
+        <w:rPr>
+          <w:lang w:val="en-US"/>
+        </w:rPr>
+        <w:t xml:space="preserve"> </w:t>
+      </w:r>
+      <w:proofErr w:type="spellStart"/>
+      <w:r>
+        <w:rPr>
+          <w:lang w:val="en-US"/>
+        </w:rPr>
+        <w:t>terena</w:t>
+      </w:r>
+      <w:proofErr w:type="spellEnd"/>
+      <w:r>
+        <w:rPr>
+          <w:lang w:val="en-US"/>
+        </w:rPr>
+        <w:t xml:space="preserve"> za </w:t>
+      </w:r>
+      <w:proofErr w:type="gramStart"/>
+      <w:r>
+        <w:rPr>
+          <w:lang w:val="en-US"/>
+        </w:rPr>
+        <w:t>basket,  koji</w:t>
+      </w:r>
+      <w:proofErr w:type="gramEnd"/>
+      <w:r>
+        <w:rPr>
+          <w:lang w:val="en-US"/>
+        </w:rPr>
+        <w:t xml:space="preserve"> </w:t>
+      </w:r>
+      <w:proofErr w:type="spellStart"/>
+      <w:r>
+        <w:rPr>
+          <w:lang w:val="en-US"/>
+        </w:rPr>
+        <w:t>nije</w:t>
+      </w:r>
+      <w:proofErr w:type="spellEnd"/>
+      <w:r>
+        <w:rPr>
+          <w:lang w:val="en-US"/>
+        </w:rPr>
+        <w:t xml:space="preserve"> </w:t>
+      </w:r>
+      <w:proofErr w:type="spellStart"/>
+      <w:r>
+        <w:rPr>
+          <w:lang w:val="en-US"/>
+        </w:rPr>
+        <w:t>takmicarski</w:t>
+      </w:r>
+      <w:proofErr w:type="spellEnd"/>
+      <w:r>
+        <w:rPr>
+          <w:lang w:val="en-US"/>
+        </w:rPr>
+        <w:t xml:space="preserve">, mi </w:t>
+      </w:r>
+      <w:proofErr w:type="spellStart"/>
+      <w:r>
+        <w:rPr>
+          <w:lang w:val="en-US"/>
+        </w:rPr>
+        <w:t>preporucujemo</w:t>
+      </w:r>
+      <w:proofErr w:type="spellEnd"/>
+      <w:r>
+        <w:rPr>
+          <w:lang w:val="en-US"/>
+        </w:rPr>
+        <w:t xml:space="preserve"> da </w:t>
+      </w:r>
+      <w:proofErr w:type="spellStart"/>
+      <w:r>
+        <w:rPr>
+          <w:lang w:val="en-US"/>
+        </w:rPr>
+        <w:t>bude</w:t>
+      </w:r>
+      <w:proofErr w:type="spellEnd"/>
+      <w:r>
+        <w:rPr>
+          <w:lang w:val="en-US"/>
+        </w:rPr>
+        <w:t xml:space="preserve"> 16x11. </w:t>
+      </w:r>
+      <w:proofErr w:type="spellStart"/>
+      <w:r>
+        <w:rPr>
+          <w:lang w:val="en-US"/>
+        </w:rPr>
+        <w:t>Naravno</w:t>
+      </w:r>
+      <w:proofErr w:type="spellEnd"/>
+      <w:r>
+        <w:rPr>
+          <w:lang w:val="en-US"/>
+        </w:rPr>
+        <w:t xml:space="preserve">, mi </w:t>
+      </w:r>
+      <w:proofErr w:type="spellStart"/>
+      <w:r>
+        <w:rPr>
+          <w:lang w:val="en-US"/>
+        </w:rPr>
+        <w:t>mozemo</w:t>
+      </w:r>
+      <w:proofErr w:type="spellEnd"/>
+      <w:r>
+        <w:rPr>
+          <w:lang w:val="en-US"/>
+        </w:rPr>
+        <w:t xml:space="preserve"> da </w:t>
+      </w:r>
+      <w:proofErr w:type="spellStart"/>
+      <w:r>
+        <w:rPr>
+          <w:lang w:val="en-US"/>
+        </w:rPr>
+        <w:t>prilagodimo</w:t>
+      </w:r>
+      <w:proofErr w:type="spellEnd"/>
+      <w:r>
+        <w:rPr>
+          <w:lang w:val="en-US"/>
+        </w:rPr>
+        <w:t xml:space="preserve"> </w:t>
+      </w:r>
+      <w:proofErr w:type="spellStart"/>
+      <w:r>
+        <w:rPr>
+          <w:lang w:val="en-US"/>
+        </w:rPr>
+        <w:t>i</w:t>
+      </w:r>
+      <w:proofErr w:type="spellEnd"/>
+      <w:r>
+        <w:rPr>
+          <w:lang w:val="en-US"/>
+        </w:rPr>
+        <w:t xml:space="preserve"> </w:t>
+      </w:r>
+      <w:proofErr w:type="spellStart"/>
+      <w:r>
+        <w:rPr>
+          <w:lang w:val="en-US"/>
+        </w:rPr>
+        <w:t>dimenziju</w:t>
+      </w:r>
+      <w:proofErr w:type="spellEnd"/>
+      <w:r>
+        <w:rPr>
+          <w:lang w:val="en-US"/>
+        </w:rPr>
+        <w:t xml:space="preserve"> </w:t>
+      </w:r>
+      <w:proofErr w:type="spellStart"/>
+      <w:r>
+        <w:rPr>
+          <w:lang w:val="en-US"/>
+        </w:rPr>
+        <w:t>terena</w:t>
+      </w:r>
+      <w:proofErr w:type="spellEnd"/>
+      <w:r>
+        <w:rPr>
+          <w:lang w:val="en-US"/>
+        </w:rPr>
+        <w:t xml:space="preserve"> </w:t>
+      </w:r>
+      <w:proofErr w:type="spellStart"/>
+      <w:r>
+        <w:rPr>
+          <w:lang w:val="en-US"/>
+        </w:rPr>
+        <w:t>vasim</w:t>
+      </w:r>
+      <w:proofErr w:type="spellEnd"/>
+      <w:r>
+        <w:rPr>
+          <w:lang w:val="en-US"/>
+        </w:rPr>
+        <w:t xml:space="preserve"> </w:t>
+      </w:r>
+      <w:proofErr w:type="spellStart"/>
+      <w:r>
+        <w:rPr>
+          <w:lang w:val="en-US"/>
+        </w:rPr>
+        <w:t>potrebama</w:t>
+      </w:r>
+      <w:proofErr w:type="spellEnd"/>
+      <w:r>
+        <w:rPr>
+          <w:lang w:val="en-US"/>
+        </w:rPr>
+        <w:t xml:space="preserve">, </w:t>
+      </w:r>
+      <w:proofErr w:type="spellStart"/>
+      <w:r>
+        <w:rPr>
+          <w:lang w:val="en-US"/>
+        </w:rPr>
+        <w:t>mogucnostima</w:t>
+      </w:r>
+      <w:proofErr w:type="spellEnd"/>
+      <w:r>
+        <w:rPr>
+          <w:lang w:val="en-US"/>
+        </w:rPr>
+        <w:t xml:space="preserve"> </w:t>
+      </w:r>
+      <w:proofErr w:type="spellStart"/>
+      <w:r>
+        <w:rPr>
+          <w:lang w:val="en-US"/>
+        </w:rPr>
+        <w:t>i</w:t>
+      </w:r>
+      <w:proofErr w:type="spellEnd"/>
+      <w:r>
+        <w:rPr>
+          <w:lang w:val="en-US"/>
+        </w:rPr>
+        <w:t xml:space="preserve"> </w:t>
+      </w:r>
+      <w:proofErr w:type="spellStart"/>
+      <w:r>
+        <w:rPr>
+          <w:lang w:val="en-US"/>
+        </w:rPr>
+        <w:t>prostoru</w:t>
+      </w:r>
+      <w:proofErr w:type="spellEnd"/>
+      <w:r>
+        <w:rPr>
+          <w:lang w:val="en-US"/>
+        </w:rPr>
+        <w:t xml:space="preserve"> koji </w:t>
+      </w:r>
+      <w:proofErr w:type="spellStart"/>
+      <w:r>
+        <w:rPr>
+          <w:lang w:val="en-US"/>
+        </w:rPr>
+        <w:lastRenderedPageBreak/>
+        <w:t>imate</w:t>
+      </w:r>
+      <w:proofErr w:type="spellEnd"/>
+      <w:r>
+        <w:rPr>
+          <w:lang w:val="en-US"/>
+        </w:rPr>
+        <w:t xml:space="preserve">. </w:t>
+      </w:r>
+      <w:proofErr w:type="spellStart"/>
+      <w:r>
+        <w:rPr>
+          <w:lang w:val="en-US"/>
+        </w:rPr>
+        <w:t>Cesto</w:t>
+      </w:r>
+      <w:proofErr w:type="spellEnd"/>
+      <w:r>
+        <w:rPr>
+          <w:lang w:val="en-US"/>
+        </w:rPr>
+        <w:t xml:space="preserve"> se </w:t>
+      </w:r>
+      <w:proofErr w:type="spellStart"/>
+      <w:r>
+        <w:rPr>
+          <w:lang w:val="en-US"/>
+        </w:rPr>
+        <w:t>desava</w:t>
+      </w:r>
+      <w:proofErr w:type="spellEnd"/>
+      <w:r>
+        <w:rPr>
+          <w:lang w:val="en-US"/>
+        </w:rPr>
+        <w:t xml:space="preserve"> da </w:t>
+      </w:r>
+      <w:proofErr w:type="spellStart"/>
+      <w:r>
+        <w:rPr>
+          <w:lang w:val="en-US"/>
+        </w:rPr>
+        <w:t>klijent</w:t>
+      </w:r>
+      <w:proofErr w:type="spellEnd"/>
+      <w:r>
+        <w:rPr>
+          <w:lang w:val="en-US"/>
+        </w:rPr>
+        <w:t xml:space="preserve"> </w:t>
+      </w:r>
+      <w:proofErr w:type="spellStart"/>
+      <w:r>
+        <w:rPr>
+          <w:lang w:val="en-US"/>
+        </w:rPr>
+        <w:t>zeli</w:t>
+      </w:r>
+      <w:proofErr w:type="spellEnd"/>
+      <w:r>
+        <w:rPr>
+          <w:lang w:val="en-US"/>
+        </w:rPr>
+        <w:t xml:space="preserve"> da mu </w:t>
+      </w:r>
+      <w:proofErr w:type="spellStart"/>
+      <w:r>
+        <w:rPr>
+          <w:lang w:val="en-US"/>
+        </w:rPr>
+        <w:t>teren</w:t>
+      </w:r>
+      <w:proofErr w:type="spellEnd"/>
+      <w:r>
+        <w:rPr>
+          <w:lang w:val="en-US"/>
+        </w:rPr>
+        <w:t xml:space="preserve"> </w:t>
+      </w:r>
+      <w:proofErr w:type="spellStart"/>
+      <w:r>
+        <w:rPr>
+          <w:lang w:val="en-US"/>
+        </w:rPr>
+        <w:t>bude</w:t>
+      </w:r>
+      <w:proofErr w:type="spellEnd"/>
+      <w:r>
+        <w:rPr>
+          <w:lang w:val="en-US"/>
+        </w:rPr>
+        <w:t xml:space="preserve"> </w:t>
+      </w:r>
+      <w:proofErr w:type="spellStart"/>
+      <w:r>
+        <w:rPr>
+          <w:lang w:val="en-US"/>
+        </w:rPr>
+        <w:t>i</w:t>
+      </w:r>
+      <w:proofErr w:type="spellEnd"/>
+      <w:r>
+        <w:rPr>
+          <w:lang w:val="en-US"/>
+        </w:rPr>
+        <w:t xml:space="preserve"> </w:t>
+      </w:r>
+      <w:proofErr w:type="spellStart"/>
+      <w:r>
+        <w:rPr>
+          <w:lang w:val="en-US"/>
+        </w:rPr>
+        <w:t>vecih</w:t>
+      </w:r>
+      <w:proofErr w:type="spellEnd"/>
+      <w:r>
+        <w:rPr>
+          <w:lang w:val="en-US"/>
+        </w:rPr>
+        <w:t xml:space="preserve"> </w:t>
+      </w:r>
+      <w:proofErr w:type="spellStart"/>
+      <w:r>
+        <w:rPr>
+          <w:lang w:val="en-US"/>
+        </w:rPr>
+        <w:t>dimenyija</w:t>
+      </w:r>
+      <w:proofErr w:type="spellEnd"/>
+      <w:r>
+        <w:rPr>
+          <w:lang w:val="en-US"/>
+        </w:rPr>
+        <w:t xml:space="preserve"> </w:t>
+      </w:r>
+      <w:proofErr w:type="spellStart"/>
+      <w:r>
+        <w:rPr>
+          <w:lang w:val="en-US"/>
+        </w:rPr>
+        <w:t>kako</w:t>
+      </w:r>
+      <w:proofErr w:type="spellEnd"/>
+      <w:r>
+        <w:rPr>
+          <w:lang w:val="en-US"/>
+        </w:rPr>
+        <w:t xml:space="preserve"> </w:t>
+      </w:r>
+      <w:proofErr w:type="spellStart"/>
+      <w:r>
+        <w:rPr>
+          <w:lang w:val="en-US"/>
+        </w:rPr>
+        <w:t>bi</w:t>
+      </w:r>
+      <w:proofErr w:type="spellEnd"/>
+      <w:r>
+        <w:rPr>
+          <w:lang w:val="en-US"/>
+        </w:rPr>
+        <w:t xml:space="preserve"> u </w:t>
+      </w:r>
+      <w:proofErr w:type="spellStart"/>
+      <w:r>
+        <w:rPr>
+          <w:lang w:val="en-US"/>
+        </w:rPr>
+        <w:t>njemu</w:t>
+      </w:r>
+      <w:proofErr w:type="spellEnd"/>
+      <w:r>
+        <w:rPr>
+          <w:lang w:val="en-US"/>
+        </w:rPr>
+        <w:t xml:space="preserve"> </w:t>
+      </w:r>
+      <w:proofErr w:type="spellStart"/>
+      <w:r>
+        <w:rPr>
+          <w:lang w:val="en-US"/>
+        </w:rPr>
+        <w:t>imao</w:t>
+      </w:r>
+      <w:proofErr w:type="spellEnd"/>
+      <w:r>
+        <w:rPr>
+          <w:lang w:val="en-US"/>
+        </w:rPr>
+        <w:t xml:space="preserve"> </w:t>
+      </w:r>
+      <w:proofErr w:type="spellStart"/>
+      <w:r>
+        <w:rPr>
+          <w:lang w:val="en-US"/>
+        </w:rPr>
+        <w:t>i</w:t>
+      </w:r>
+      <w:proofErr w:type="spellEnd"/>
+      <w:r>
+        <w:rPr>
+          <w:lang w:val="en-US"/>
+        </w:rPr>
+        <w:t xml:space="preserve"> </w:t>
+      </w:r>
+      <w:proofErr w:type="spellStart"/>
+      <w:r>
+        <w:rPr>
+          <w:lang w:val="en-US"/>
+        </w:rPr>
+        <w:t>teren</w:t>
+      </w:r>
+      <w:proofErr w:type="spellEnd"/>
+      <w:r>
+        <w:rPr>
+          <w:lang w:val="en-US"/>
+        </w:rPr>
+        <w:t xml:space="preserve"> za </w:t>
+      </w:r>
+      <w:proofErr w:type="spellStart"/>
+      <w:r>
+        <w:rPr>
+          <w:lang w:val="en-US"/>
+        </w:rPr>
+        <w:t>odbojku</w:t>
+      </w:r>
+      <w:proofErr w:type="spellEnd"/>
+      <w:r>
+        <w:rPr>
+          <w:lang w:val="en-US"/>
+        </w:rPr>
+        <w:t xml:space="preserve"> </w:t>
+      </w:r>
+      <w:proofErr w:type="spellStart"/>
+      <w:r>
+        <w:rPr>
+          <w:lang w:val="en-US"/>
+        </w:rPr>
+        <w:t>i</w:t>
+      </w:r>
+      <w:proofErr w:type="spellEnd"/>
+      <w:r>
+        <w:rPr>
+          <w:lang w:val="en-US"/>
+        </w:rPr>
+        <w:t xml:space="preserve"> mini </w:t>
+      </w:r>
+      <w:proofErr w:type="spellStart"/>
+      <w:r>
+        <w:rPr>
+          <w:lang w:val="en-US"/>
+        </w:rPr>
+        <w:t>fudbal</w:t>
+      </w:r>
+      <w:proofErr w:type="spellEnd"/>
+      <w:r>
+        <w:rPr>
+          <w:lang w:val="en-US"/>
+        </w:rPr>
+        <w:t xml:space="preserve">.   </w:t>
+      </w:r>
+      <w:proofErr w:type="spellStart"/>
+      <w:r>
+        <w:rPr>
+          <w:lang w:val="en-US"/>
+        </w:rPr>
+        <w:t>Detaljnije</w:t>
+      </w:r>
+      <w:proofErr w:type="spellEnd"/>
+      <w:r>
+        <w:rPr>
+          <w:lang w:val="en-US"/>
+        </w:rPr>
+        <w:t xml:space="preserve"> mere (</w:t>
+      </w:r>
+      <w:proofErr w:type="spellStart"/>
+      <w:r>
+        <w:rPr>
+          <w:lang w:val="en-US"/>
+        </w:rPr>
+        <w:t>linija</w:t>
+      </w:r>
+      <w:proofErr w:type="spellEnd"/>
+      <w:r>
+        <w:rPr>
+          <w:lang w:val="en-US"/>
+        </w:rPr>
+        <w:t xml:space="preserve"> za tri </w:t>
+      </w:r>
+      <w:proofErr w:type="spellStart"/>
+      <w:r>
+        <w:rPr>
+          <w:lang w:val="en-US"/>
+        </w:rPr>
+        <w:t>poena</w:t>
+      </w:r>
+      <w:proofErr w:type="spellEnd"/>
+      <w:r>
+        <w:rPr>
+          <w:lang w:val="en-US"/>
+        </w:rPr>
+        <w:t xml:space="preserve">, </w:t>
+      </w:r>
+      <w:proofErr w:type="spellStart"/>
+      <w:r>
+        <w:rPr>
+          <w:lang w:val="en-US"/>
+        </w:rPr>
+        <w:t>reket</w:t>
+      </w:r>
+      <w:proofErr w:type="spellEnd"/>
+      <w:r>
+        <w:rPr>
+          <w:lang w:val="en-US"/>
+        </w:rPr>
+        <w:t xml:space="preserve">, </w:t>
+      </w:r>
+      <w:proofErr w:type="spellStart"/>
+      <w:r>
+        <w:rPr>
+          <w:lang w:val="en-US"/>
+        </w:rPr>
+        <w:t>visina</w:t>
+      </w:r>
+      <w:proofErr w:type="spellEnd"/>
+      <w:r>
+        <w:rPr>
+          <w:lang w:val="en-US"/>
+        </w:rPr>
+        <w:t xml:space="preserve"> </w:t>
+      </w:r>
+      <w:proofErr w:type="spellStart"/>
+      <w:r>
+        <w:rPr>
+          <w:lang w:val="en-US"/>
+        </w:rPr>
+        <w:t>koša</w:t>
+      </w:r>
+      <w:proofErr w:type="spellEnd"/>
+      <w:r>
+        <w:rPr>
+          <w:lang w:val="en-US"/>
+        </w:rPr>
+        <w:t xml:space="preserve">) </w:t>
+      </w:r>
+      <w:proofErr w:type="spellStart"/>
+      <w:r>
+        <w:rPr>
+          <w:lang w:val="en-US"/>
+        </w:rPr>
+        <w:t>pogledajte</w:t>
+      </w:r>
+      <w:proofErr w:type="spellEnd"/>
+      <w:r>
+        <w:rPr>
+          <w:lang w:val="en-US"/>
+        </w:rPr>
+        <w:t xml:space="preserve"> </w:t>
+      </w:r>
+      <w:proofErr w:type="spellStart"/>
+      <w:r>
+        <w:rPr>
+          <w:lang w:val="en-US"/>
+        </w:rPr>
+        <w:t>na</w:t>
+      </w:r>
+      <w:proofErr w:type="spellEnd"/>
+      <w:r>
+        <w:rPr>
+          <w:lang w:val="en-US"/>
+        </w:rPr>
+        <w:t xml:space="preserve"> </w:t>
+      </w:r>
+      <w:proofErr w:type="spellStart"/>
+      <w:r>
+        <w:rPr>
+          <w:lang w:val="en-US"/>
+        </w:rPr>
+        <w:t>stranici</w:t>
+      </w:r>
+      <w:proofErr w:type="spellEnd"/>
+      <w:r>
+        <w:rPr>
+          <w:lang w:val="en-US"/>
+        </w:rPr>
+        <w:t> </w:t>
+      </w:r>
+      <w:proofErr w:type="spellStart"/>
+      <w:r>
+        <w:rPr>
+          <w:lang w:val="en-US"/>
+        </w:rPr>
+        <w:fldChar w:fldCharType="begin"/>
+      </w:r>
+      <w:r>
+        <w:rPr>
+          <w:lang w:val="en-US"/>
+        </w:rPr>
+        <w:instrText>HYPERLINK "https://staging.antasline.com/kako-napraviti-teren-za-basket-ili-kosarkaski-teren/"</w:instrText>
+      </w:r>
+      <w:r>
+        <w:rPr>
+          <w:lang w:val="en-US"/>
+        </w:rPr>
+      </w:r>
+      <w:r>
+        <w:rPr>
+          <w:lang w:val="en-US"/>
+        </w:rPr>
+        <w:fldChar w:fldCharType="separate"/>
+      </w:r>
+      <w:r>
+        <w:rPr>
+          <w:rStyle w:val="Hiperveza"/>
+          <w:b/>
+          <w:bCs/>
+          <w:lang w:val="en-US"/>
+        </w:rPr>
+        <w:t>dimenzije</w:t>
+      </w:r>
+      <w:proofErr w:type="spellEnd"/>
+      <w:r>
+        <w:rPr>
+          <w:rStyle w:val="Hiperveza"/>
+          <w:b/>
+          <w:bCs/>
+          <w:lang w:val="en-US"/>
+        </w:rPr>
+        <w:t xml:space="preserve"> </w:t>
+      </w:r>
+      <w:proofErr w:type="spellStart"/>
+      <w:r>
+        <w:rPr>
+          <w:rStyle w:val="Hiperveza"/>
+          <w:b/>
+          <w:bCs/>
+          <w:lang w:val="en-US"/>
+        </w:rPr>
+        <w:t>košarkaškog</w:t>
+      </w:r>
+      <w:proofErr w:type="spellEnd"/>
+      <w:r>
+        <w:rPr>
+          <w:rStyle w:val="Hiperveza"/>
+          <w:b/>
+          <w:bCs/>
+          <w:lang w:val="en-US"/>
+        </w:rPr>
+        <w:t xml:space="preserve"> </w:t>
+      </w:r>
+      <w:proofErr w:type="spellStart"/>
+      <w:r>
+        <w:rPr>
+          <w:rStyle w:val="Hiperveza"/>
+          <w:b/>
+          <w:bCs/>
+          <w:lang w:val="en-US"/>
+        </w:rPr>
+        <w:t>terena</w:t>
+      </w:r>
+      <w:proofErr w:type="spellEnd"/>
+      <w:r>
+        <w:fldChar w:fldCharType="end"/>
+      </w:r>
+      <w:r>
+        <w:rPr>
+          <w:lang w:val="en-US"/>
+        </w:rPr>
+        <w:t>.</w:t>
+      </w:r>
+    </w:p>
+    <w:p>
+      <w:pPr>
+        <w:rPr>
+          <w:lang w:val="en-US"/>
+        </w:rPr>
+      </w:pPr>
+      <w:proofErr w:type="spellStart"/>
+      <w:proofErr w:type="gramStart"/>
+      <w:r>
+        <w:rPr>
+          <w:lang w:val="en-US"/>
+        </w:rPr>
+        <w:t>IZGR</w:t>
+      </w:r>
+      <w:r>
+        <w:rPr>
+          <w:lang w:val="en-US"/>
+        </w:rPr>
+        <w:t>ađeni</w:t>
+      </w:r>
+      <w:proofErr w:type="spellEnd"/>
+      <w:r>
+        <w:rPr>
+          <w:lang w:val="en-US"/>
+        </w:rPr>
+        <w:t xml:space="preserve"> </w:t>
+      </w:r>
+      <w:r>
+        <w:rPr>
+          <w:lang w:val="en-US"/>
+        </w:rPr>
+        <w:t xml:space="preserve"> TERENI</w:t>
+      </w:r>
+      <w:proofErr w:type="gramEnd"/>
+    </w:p>
+    <w:p>
+      <w:pPr>
+        <w:rPr>
+          <w:lang w:val="en-US"/>
+        </w:rPr>
+      </w:pPr>
+      <w:proofErr w:type="spellStart"/>
+      <w:r>
+        <w:rPr>
+          <w:lang w:val="en-US"/>
+        </w:rPr>
+        <w:t>Stavio</w:t>
+      </w:r>
+      <w:proofErr w:type="spellEnd"/>
+      <w:r>
+        <w:rPr>
+          <w:lang w:val="en-US"/>
+        </w:rPr>
+        <w:t xml:space="preserve"> bi bar 6 </w:t>
+      </w:r>
+      <w:proofErr w:type="spellStart"/>
+      <w:r>
+        <w:rPr>
+          <w:lang w:val="en-US"/>
+        </w:rPr>
+        <w:t>slika</w:t>
+      </w:r>
+      <w:proofErr w:type="spellEnd"/>
+      <w:r>
+        <w:rPr>
+          <w:lang w:val="en-US"/>
+        </w:rPr>
+        <w:t xml:space="preserve"> </w:t>
+      </w:r>
+      <w:proofErr w:type="spellStart"/>
+      <w:r>
+        <w:rPr>
+          <w:lang w:val="en-US"/>
+        </w:rPr>
+        <w:t>ako</w:t>
+      </w:r>
+      <w:proofErr w:type="spellEnd"/>
+      <w:r>
+        <w:rPr>
+          <w:lang w:val="en-US"/>
+        </w:rPr>
+        <w:t xml:space="preserve"> ne </w:t>
+      </w:r>
+      <w:proofErr w:type="spellStart"/>
+      <w:r>
+        <w:rPr>
+          <w:lang w:val="en-US"/>
+        </w:rPr>
+        <w:t>i</w:t>
+      </w:r>
+      <w:proofErr w:type="spellEnd"/>
+      <w:r>
+        <w:rPr>
+          <w:lang w:val="en-US"/>
+        </w:rPr>
+        <w:t xml:space="preserve"> 9, </w:t>
+      </w:r>
+      <w:proofErr w:type="spellStart"/>
+      <w:r>
+        <w:rPr>
+          <w:lang w:val="en-US"/>
+        </w:rPr>
+        <w:t>tu</w:t>
+      </w:r>
+      <w:proofErr w:type="spellEnd"/>
+      <w:r>
+        <w:rPr>
+          <w:lang w:val="en-US"/>
+        </w:rPr>
+        <w:t xml:space="preserve"> je </w:t>
+      </w:r>
+      <w:proofErr w:type="spellStart"/>
+      <w:r>
+        <w:rPr>
+          <w:lang w:val="en-US"/>
+        </w:rPr>
+        <w:t>bitno</w:t>
+      </w:r>
+      <w:proofErr w:type="spellEnd"/>
+      <w:r>
+        <w:rPr>
+          <w:lang w:val="en-US"/>
+        </w:rPr>
+        <w:t xml:space="preserve"> da vide </w:t>
+      </w:r>
+      <w:proofErr w:type="spellStart"/>
+      <w:r>
+        <w:rPr>
+          <w:lang w:val="en-US"/>
+        </w:rPr>
+        <w:t>sve</w:t>
+      </w:r>
+      <w:proofErr w:type="spellEnd"/>
+      <w:r>
+        <w:rPr>
+          <w:lang w:val="en-US"/>
+        </w:rPr>
+        <w:t xml:space="preserve"> </w:t>
+      </w:r>
+      <w:proofErr w:type="spellStart"/>
+      <w:r>
+        <w:rPr>
+          <w:lang w:val="en-US"/>
+        </w:rPr>
+        <w:t>mogucnost</w:t>
+      </w:r>
+      <w:proofErr w:type="spellEnd"/>
+      <w:r>
+        <w:rPr>
+          <w:lang w:val="en-US"/>
+        </w:rPr>
+        <w:t xml:space="preserve">. </w:t>
+      </w:r>
+      <w:proofErr w:type="spellStart"/>
+      <w:r>
+        <w:rPr>
+          <w:lang w:val="en-US"/>
+        </w:rPr>
+        <w:t>Stavi</w:t>
+      </w:r>
+      <w:proofErr w:type="spellEnd"/>
+      <w:r>
+        <w:rPr>
+          <w:lang w:val="en-US"/>
+        </w:rPr>
+        <w:t xml:space="preserve"> 9 </w:t>
+      </w:r>
+      <w:proofErr w:type="spellStart"/>
+      <w:r>
+        <w:rPr>
+          <w:lang w:val="en-US"/>
+        </w:rPr>
+        <w:t>slika</w:t>
+      </w:r>
+      <w:proofErr w:type="spellEnd"/>
+    </w:p>
+    <w:p/>
+    <w:p/>
+    <w:p>
+      <w:pPr>
         <w:pStyle w:val="Naslov2"/>
       </w:pPr>
       <w:r>
@@ -206,7 +1767,7 @@
       <w:r>
         <w:t xml:space="preserve"> kao na </w:t>
       </w:r>
-      <w:hyperlink r:id="rId5" w:history="1">
+      <w:hyperlink r:id="rId7" w:history="1">
         <w:r>
           <w:rPr>
             <w:rStyle w:val="Hiperveza"/>
@@ -229,7 +1790,6 @@
       </w:r>
     </w:p>
     <w:p/>
-    <w:p/>
     <w:p>
       <w:pPr>
         <w:pStyle w:val="Naslov2"/>
@@ -269,7 +1829,6 @@
     </w:p>
     <w:p>
       <w:r>
-        <w:lastRenderedPageBreak/>
         <w:t xml:space="preserve">U </w:t>
       </w:r>
       <w:proofErr w:type="spellStart"/>
@@ -299,13 +1858,13 @@
         <w:t xml:space="preserve"> je dugme za poziv mobilnog telefona, ali je ikonica loša. Treba da bude telefonska slušalica ili slično, da naglasi da će da se izvrši poziv klikom na dugme.</w:t>
       </w:r>
     </w:p>
-    <w:p/>
     <w:p/>
     <w:p>
       <w:pPr>
         <w:pStyle w:val="Naslov2"/>
       </w:pPr>
       <w:r>
+        <w:lastRenderedPageBreak/>
         <w:t xml:space="preserve">Planer terena </w:t>
       </w:r>
     </w:p>
@@ -330,7 +1889,7 @@
                     <pic:cNvPicPr/>
                   </pic:nvPicPr>
                   <pic:blipFill>
-                    <a:blip r:embed="rId6"/>
+                    <a:blip r:embed="rId8"/>
                     <a:stretch>
                       <a:fillRect/>
                     </a:stretch>
@@ -361,7 +1920,6 @@
         <w:rPr>
           <w:noProof/>
         </w:rPr>
-        <w:lastRenderedPageBreak/>
         <w:drawing>
           <wp:inline distT="0" distB="0" distL="0" distR="0" wp14:anchorId="2C6A1C15" wp14:editId="42E7023E">
             <wp:extent cx="3896140" cy="3604531"/>
@@ -378,7 +1936,7 @@
                     <pic:cNvPicPr/>
                   </pic:nvPicPr>
                   <pic:blipFill>
-                    <a:blip r:embed="rId7"/>
+                    <a:blip r:embed="rId9"/>
                     <a:stretch>
                       <a:fillRect/>
                     </a:stretch>
@@ -413,101 +1971,62 @@
       </w:r>
     </w:p>
     <w:p>
-      <w:pPr>
-        <w:pStyle w:val="Naslov2"/>
-      </w:pPr>
-      <w:r>
-        <w:t xml:space="preserve">Pomoć drugih </w:t>
-      </w:r>
-      <w:proofErr w:type="spellStart"/>
-      <w:r>
-        <w:t>ai</w:t>
-      </w:r>
-      <w:proofErr w:type="spellEnd"/>
-    </w:p>
-    <w:p>
-      <w:r>
-        <w:t xml:space="preserve">Gemini, Microsoft </w:t>
-      </w:r>
-      <w:proofErr w:type="spellStart"/>
-      <w:r>
-        <w:t>Copilot</w:t>
-      </w:r>
-      <w:proofErr w:type="spellEnd"/>
-      <w:r>
-        <w:t xml:space="preserve">, </w:t>
-      </w:r>
-      <w:proofErr w:type="spellStart"/>
-      <w:r>
-        <w:t>DeepSeek</w:t>
-      </w:r>
-      <w:proofErr w:type="spellEnd"/>
-      <w:r>
-        <w:t xml:space="preserve">, </w:t>
-      </w:r>
-      <w:proofErr w:type="spellStart"/>
-      <w:r>
-        <w:t>Perplexity</w:t>
-      </w:r>
-      <w:proofErr w:type="spellEnd"/>
-      <w:r>
-        <w:t xml:space="preserve">, </w:t>
-      </w:r>
-      <w:proofErr w:type="spellStart"/>
-      <w:r>
-        <w:t>ChatGPT</w:t>
-      </w:r>
-      <w:proofErr w:type="spellEnd"/>
-      <w:r>
-        <w:t xml:space="preserve">, Grok, </w:t>
-      </w:r>
-      <w:proofErr w:type="spellStart"/>
-      <w:r>
-        <w:t>Kimi</w:t>
-      </w:r>
-      <w:proofErr w:type="spellEnd"/>
-      <w:r>
-        <w:t xml:space="preserve">, </w:t>
-      </w:r>
-      <w:proofErr w:type="spellStart"/>
-      <w:r>
-        <w:t>Qwen</w:t>
-      </w:r>
-      <w:proofErr w:type="spellEnd"/>
-      <w:r>
-        <w:t xml:space="preserve">, </w:t>
-      </w:r>
-      <w:proofErr w:type="spellStart"/>
-      <w:r>
-        <w:t>GitHub</w:t>
-      </w:r>
-      <w:proofErr w:type="spellEnd"/>
-      <w:r>
-        <w:t xml:space="preserve"> </w:t>
-      </w:r>
-      <w:proofErr w:type="spellStart"/>
-      <w:r>
-        <w:t>Copilot</w:t>
-      </w:r>
-      <w:proofErr w:type="spellEnd"/>
-      <w:r>
-        <w:t xml:space="preserve">, </w:t>
-      </w:r>
-      <w:proofErr w:type="spellStart"/>
-      <w:r>
-        <w:t>Cursor</w:t>
-      </w:r>
-      <w:proofErr w:type="spellEnd"/>
-      <w:r>
-        <w:t xml:space="preserve">, </w:t>
-      </w:r>
-      <w:proofErr w:type="spellStart"/>
-      <w:r>
-        <w:t>Manus</w:t>
-      </w:r>
-      <w:proofErr w:type="spellEnd"/>
-      <w:r>
-        <w:t xml:space="preserve"> </w:t>
+      <w:r>
+        <w:lastRenderedPageBreak/>
+        <w:t>20.08.</w:t>
+      </w:r>
+    </w:p>
+    <w:p>
+      <w:hyperlink r:id="rId10" w:history="1">
+        <w:r>
+          <w:rPr>
+            <w:rStyle w:val="Hiperveza"/>
+          </w:rPr>
+          <w:t>http://localhost/antasline/katalog/</w:t>
+        </w:r>
+      </w:hyperlink>
+      <w:r>
+        <w:t xml:space="preserve"> prikazuje sve proizvode, treba da prikazuje kategorije. Na mobilnom nema ni jednog proizvoda. Treba da ima side menu sa kategorijama</w:t>
+      </w:r>
+    </w:p>
+    <w:p>
+      <w:r>
+        <w:t xml:space="preserve">na Mobilnom treba da ima </w:t>
+      </w:r>
+      <w:proofErr w:type="spellStart"/>
+      <w:r>
+        <w:t>zatamjenje</w:t>
+      </w:r>
+      <w:proofErr w:type="spellEnd"/>
+      <w:r>
+        <w:t xml:space="preserve"> na </w:t>
+      </w:r>
+      <w:proofErr w:type="spellStart"/>
+      <w:r>
+        <w:t>hero</w:t>
+      </w:r>
+      <w:proofErr w:type="spellEnd"/>
+      <w:r>
+        <w:t xml:space="preserve"> sekciji na svim stranicama, kao na desktopu.</w:t>
+      </w:r>
+    </w:p>
+    <w:p/>
+    <w:p>
+      <w:r>
+        <w:t>Planer terena</w:t>
+      </w:r>
+    </w:p>
+    <w:p>
+      <w:r>
+        <w:t xml:space="preserve">Teren za 3x3 je sada čudnog izgleda. Prevelike su kocke, veće nego na ostalim, i mora da se </w:t>
+      </w:r>
+      <w:proofErr w:type="spellStart"/>
+      <w:r>
+        <w:t>skroluje</w:t>
+      </w:r>
+      <w:proofErr w:type="spellEnd"/>
+      <w:r>
+        <w:t xml:space="preserve"> na dole.</w:t>
       </w:r>
     </w:p>
     <w:p/>
@@ -974,7 +2493,6 @@
     <w:next w:val="Normal"/>
     <w:link w:val="Naslov3Char"/>
     <w:uiPriority w:val="9"/>
-    <w:semiHidden/>
     <w:unhideWhenUsed/>
     <w:qFormat/>
     <w:rsid w:val="000F340A"/>
@@ -1126,7 +2644,6 @@
   <w:style w:type="character" w:default="1" w:styleId="Podrazumevanifontpasusa">
     <w:name w:val="Default Paragraph Font"/>
     <w:uiPriority w:val="1"/>
-    <w:semiHidden/>
     <w:unhideWhenUsed/>
   </w:style>
   <w:style w:type="table" w:default="1" w:styleId="Normalnatabela">
@@ -1181,7 +2698,6 @@
     <w:basedOn w:val="Podrazumevanifontpasusa"/>
     <w:link w:val="Naslov3"/>
     <w:uiPriority w:val="9"/>
-    <w:semiHidden/>
     <w:rsid w:val="000F340A"/>
     <w:rPr>
       <w:rFonts w:eastAsiaTheme="majorEastAsia" w:cstheme="majorBidi"/>

</xml_diff>